<commit_message>
Completa documentación del portafolio del Sprint 2
- Agrega asignación de roles y responsabilidades (md y docx), con el reparto de entregables entre integrantes y la aclaración de que el historial de git no refleja la distribución real de tareas por haber compartido equipo y configuración local parte del tiempo
- Suma la carpeta docs/gantt con el cronograma del proyecto en formato GanttProject y en CSV, contrastando la planificación de las tres semanas del sprint contra la ejecución real y marcando como desvío el período sin actividad entre el 10 y el 27 de septiembre
- Incorpora los nombres del equipo en la declaración de triple impacto y en la declaración ética sobre uso de inteligencia artificial, y regenera sus versiones en Word
</commit_message>
<xml_diff>
--- a/docs/declaracion-etica-ia.docx
+++ b/docs/declaracion-etica-ia.docx
@@ -7,7 +7,6 @@
         <w:pStyle w:val="Heading1"/>
         <w:bidi w:val="0"/>
         <w:spacing w:before="240" w:after="120"/>
-        <w:jc w:val="left"/>
         <w:rPr/>
       </w:pPr>
       <w:r>
@@ -19,7 +18,6 @@
       <w:pPr>
         <w:pStyle w:val="BodyText"/>
         <w:bidi w:val="0"/>
-        <w:jc w:val="left"/>
         <w:rPr/>
       </w:pPr>
       <w:r>
@@ -37,7 +35,23 @@
       <w:pPr>
         <w:pStyle w:val="BodyText"/>
         <w:bidi w:val="0"/>
-        <w:jc w:val="left"/>
+        <w:rPr/>
+      </w:pPr>
+      <w:r>
+        <w:rPr>
+          <w:rStyle w:val="Strong"/>
+        </w:rPr>
+        <w:t>Equipo:</w:t>
+      </w:r>
+      <w:r>
+        <w:rPr/>
+        <w:t xml:space="preserve"> Senger, Brian Leonel Miguel - Baumgatner, Jose Ignacio - Riquel, Gaston Azula</w:t>
+      </w:r>
+    </w:p>
+    <w:p>
+      <w:pPr>
+        <w:pStyle w:val="BodyText"/>
+        <w:bidi w:val="0"/>
         <w:rPr/>
       </w:pPr>
       <w:r>
@@ -51,7 +65,6 @@
       <w:pPr>
         <w:pStyle w:val="HorizontalLine"/>
         <w:bidi w:val="0"/>
-        <w:jc w:val="left"/>
         <w:rPr/>
       </w:pPr>
       <w:r>
@@ -62,7 +75,6 @@
       <w:pPr>
         <w:pStyle w:val="Heading2"/>
         <w:bidi w:val="0"/>
-        <w:jc w:val="left"/>
         <w:rPr/>
       </w:pPr>
       <w:r>
@@ -74,7 +86,6 @@
       <w:pPr>
         <w:pStyle w:val="BodyText"/>
         <w:bidi w:val="0"/>
-        <w:jc w:val="left"/>
         <w:rPr/>
       </w:pPr>
       <w:r>
@@ -96,7 +107,6 @@
       <w:pPr>
         <w:pStyle w:val="BodyText"/>
         <w:bidi w:val="0"/>
-        <w:jc w:val="left"/>
         <w:rPr/>
       </w:pPr>
       <w:r>
@@ -223,7 +233,6 @@
               <w:widowControl w:val="false"/>
               <w:suppressLineNumbers/>
               <w:bidi w:val="0"/>
-              <w:jc w:val="left"/>
               <w:rPr/>
             </w:pPr>
             <w:r>
@@ -248,7 +257,6 @@
               <w:widowControl w:val="false"/>
               <w:suppressLineNumbers/>
               <w:bidi w:val="0"/>
-              <w:jc w:val="left"/>
               <w:rPr/>
             </w:pPr>
             <w:r>
@@ -273,7 +281,6 @@
               <w:widowControl w:val="false"/>
               <w:suppressLineNumbers/>
               <w:bidi w:val="0"/>
-              <w:jc w:val="left"/>
               <w:rPr/>
             </w:pPr>
             <w:r>
@@ -301,7 +308,6 @@
               <w:widowControl w:val="false"/>
               <w:suppressLineNumbers/>
               <w:bidi w:val="0"/>
-              <w:jc w:val="left"/>
               <w:rPr/>
             </w:pPr>
             <w:r>
@@ -326,7 +332,6 @@
               <w:widowControl w:val="false"/>
               <w:suppressLineNumbers/>
               <w:bidi w:val="0"/>
-              <w:jc w:val="left"/>
               <w:rPr/>
             </w:pPr>
             <w:r>
@@ -351,7 +356,6 @@
               <w:widowControl w:val="false"/>
               <w:suppressLineNumbers/>
               <w:bidi w:val="0"/>
-              <w:jc w:val="left"/>
               <w:rPr/>
             </w:pPr>
             <w:r>
@@ -379,7 +383,6 @@
               <w:widowControl w:val="false"/>
               <w:suppressLineNumbers/>
               <w:bidi w:val="0"/>
-              <w:jc w:val="left"/>
               <w:rPr/>
             </w:pPr>
             <w:r>
@@ -404,7 +407,6 @@
               <w:widowControl w:val="false"/>
               <w:suppressLineNumbers/>
               <w:bidi w:val="0"/>
-              <w:jc w:val="left"/>
               <w:rPr/>
             </w:pPr>
             <w:r>
@@ -429,7 +431,6 @@
               <w:widowControl w:val="false"/>
               <w:suppressLineNumbers/>
               <w:bidi w:val="0"/>
-              <w:jc w:val="left"/>
               <w:rPr/>
             </w:pPr>
             <w:r>
@@ -457,7 +458,6 @@
               <w:widowControl w:val="false"/>
               <w:suppressLineNumbers/>
               <w:bidi w:val="0"/>
-              <w:jc w:val="left"/>
               <w:rPr/>
             </w:pPr>
             <w:r>
@@ -482,7 +482,6 @@
               <w:widowControl w:val="false"/>
               <w:suppressLineNumbers/>
               <w:bidi w:val="0"/>
-              <w:jc w:val="left"/>
               <w:rPr/>
             </w:pPr>
             <w:r>
@@ -507,7 +506,6 @@
               <w:widowControl w:val="false"/>
               <w:suppressLineNumbers/>
               <w:bidi w:val="0"/>
-              <w:jc w:val="left"/>
               <w:rPr/>
             </w:pPr>
             <w:r>
@@ -535,7 +533,6 @@
               <w:widowControl w:val="false"/>
               <w:suppressLineNumbers/>
               <w:bidi w:val="0"/>
-              <w:jc w:val="left"/>
               <w:rPr/>
             </w:pPr>
             <w:r>
@@ -560,7 +557,6 @@
               <w:widowControl w:val="false"/>
               <w:suppressLineNumbers/>
               <w:bidi w:val="0"/>
-              <w:jc w:val="left"/>
               <w:rPr/>
             </w:pPr>
             <w:r>
@@ -585,7 +581,6 @@
               <w:widowControl w:val="false"/>
               <w:suppressLineNumbers/>
               <w:bidi w:val="0"/>
-              <w:jc w:val="left"/>
               <w:rPr/>
             </w:pPr>
             <w:r>
@@ -613,7 +608,6 @@
               <w:widowControl w:val="false"/>
               <w:suppressLineNumbers/>
               <w:bidi w:val="0"/>
-              <w:jc w:val="left"/>
               <w:rPr/>
             </w:pPr>
             <w:r>
@@ -638,7 +632,6 @@
               <w:widowControl w:val="false"/>
               <w:suppressLineNumbers/>
               <w:bidi w:val="0"/>
-              <w:jc w:val="left"/>
               <w:rPr/>
             </w:pPr>
             <w:r>
@@ -663,7 +656,6 @@
               <w:widowControl w:val="false"/>
               <w:suppressLineNumbers/>
               <w:bidi w:val="0"/>
-              <w:jc w:val="left"/>
               <w:rPr/>
             </w:pPr>
             <w:r>
@@ -691,7 +683,6 @@
               <w:widowControl w:val="false"/>
               <w:suppressLineNumbers/>
               <w:bidi w:val="0"/>
-              <w:jc w:val="left"/>
               <w:rPr/>
             </w:pPr>
             <w:r>
@@ -716,7 +707,6 @@
               <w:widowControl w:val="false"/>
               <w:suppressLineNumbers/>
               <w:bidi w:val="0"/>
-              <w:jc w:val="left"/>
               <w:rPr/>
             </w:pPr>
             <w:r>
@@ -741,7 +731,6 @@
               <w:widowControl w:val="false"/>
               <w:suppressLineNumbers/>
               <w:bidi w:val="0"/>
-              <w:jc w:val="left"/>
               <w:rPr/>
             </w:pPr>
             <w:r>
@@ -756,7 +745,6 @@
       <w:pPr>
         <w:pStyle w:val="BodyText"/>
         <w:bidi w:val="0"/>
-        <w:jc w:val="left"/>
         <w:rPr/>
       </w:pPr>
       <w:r>
@@ -768,7 +756,6 @@
       <w:pPr>
         <w:pStyle w:val="HorizontalLine"/>
         <w:bidi w:val="0"/>
-        <w:jc w:val="left"/>
         <w:rPr/>
       </w:pPr>
       <w:r>
@@ -779,7 +766,6 @@
       <w:pPr>
         <w:pStyle w:val="Heading2"/>
         <w:bidi w:val="0"/>
-        <w:jc w:val="left"/>
         <w:rPr/>
       </w:pPr>
       <w:r>
@@ -791,7 +777,6 @@
       <w:pPr>
         <w:pStyle w:val="BodyText"/>
         <w:bidi w:val="0"/>
-        <w:jc w:val="left"/>
         <w:rPr/>
       </w:pPr>
       <w:r>
@@ -813,7 +798,6 @@
       <w:pPr>
         <w:pStyle w:val="Heading3"/>
         <w:bidi w:val="0"/>
-        <w:jc w:val="left"/>
         <w:rPr/>
       </w:pPr>
       <w:r>
@@ -825,7 +809,6 @@
       <w:pPr>
         <w:pStyle w:val="BodyText"/>
         <w:bidi w:val="0"/>
-        <w:jc w:val="left"/>
         <w:rPr/>
       </w:pPr>
       <w:r>
@@ -847,7 +830,6 @@
       <w:pPr>
         <w:pStyle w:val="BodyText"/>
         <w:bidi w:val="0"/>
-        <w:jc w:val="left"/>
         <w:rPr/>
       </w:pPr>
       <w:r>
@@ -869,7 +851,6 @@
       <w:pPr>
         <w:pStyle w:val="BodyText"/>
         <w:bidi w:val="0"/>
-        <w:jc w:val="left"/>
         <w:rPr/>
       </w:pPr>
       <w:r>
@@ -891,7 +872,6 @@
       <w:pPr>
         <w:pStyle w:val="Heading3"/>
         <w:bidi w:val="0"/>
-        <w:jc w:val="left"/>
         <w:rPr/>
       </w:pPr>
       <w:r>
@@ -903,7 +883,6 @@
       <w:pPr>
         <w:pStyle w:val="BodyText"/>
         <w:bidi w:val="0"/>
-        <w:jc w:val="left"/>
         <w:rPr/>
       </w:pPr>
       <w:r>
@@ -915,7 +894,6 @@
       <w:pPr>
         <w:pStyle w:val="Heading3"/>
         <w:bidi w:val="0"/>
-        <w:jc w:val="left"/>
         <w:rPr/>
       </w:pPr>
       <w:r>
@@ -927,7 +905,6 @@
       <w:pPr>
         <w:pStyle w:val="BodyText"/>
         <w:bidi w:val="0"/>
-        <w:jc w:val="left"/>
         <w:rPr/>
       </w:pPr>
       <w:r>
@@ -939,7 +916,6 @@
       <w:pPr>
         <w:pStyle w:val="HorizontalLine"/>
         <w:bidi w:val="0"/>
-        <w:jc w:val="left"/>
         <w:rPr/>
       </w:pPr>
       <w:r>
@@ -950,7 +926,6 @@
       <w:pPr>
         <w:pStyle w:val="Heading2"/>
         <w:bidi w:val="0"/>
-        <w:jc w:val="left"/>
         <w:rPr/>
       </w:pPr>
       <w:r>
@@ -972,7 +947,6 @@
         <w:bidi w:val="0"/>
         <w:spacing w:before="0" w:after="0"/>
         <w:ind w:hanging="283" w:left="709"/>
-        <w:jc w:val="left"/>
         <w:rPr/>
       </w:pPr>
       <w:r>
@@ -1000,7 +974,6 @@
         <w:bidi w:val="0"/>
         <w:spacing w:before="0" w:after="0"/>
         <w:ind w:hanging="283" w:left="709"/>
-        <w:jc w:val="left"/>
         <w:rPr/>
       </w:pPr>
       <w:r>
@@ -1028,7 +1001,6 @@
         <w:bidi w:val="0"/>
         <w:spacing w:before="0" w:after="0"/>
         <w:ind w:hanging="283" w:left="709"/>
-        <w:jc w:val="left"/>
         <w:rPr/>
       </w:pPr>
       <w:r>
@@ -1056,7 +1028,6 @@
         <w:bidi w:val="0"/>
         <w:spacing w:before="0" w:after="0"/>
         <w:ind w:hanging="283" w:left="709"/>
-        <w:jc w:val="left"/>
         <w:rPr/>
       </w:pPr>
       <w:r>
@@ -1083,7 +1054,6 @@
         </w:tabs>
         <w:bidi w:val="0"/>
         <w:ind w:hanging="283" w:left="709"/>
-        <w:jc w:val="left"/>
         <w:rPr/>
       </w:pPr>
       <w:r>
@@ -1101,7 +1071,6 @@
       <w:pPr>
         <w:pStyle w:val="HorizontalLine"/>
         <w:bidi w:val="0"/>
-        <w:jc w:val="left"/>
         <w:rPr/>
       </w:pPr>
       <w:r>
@@ -1112,7 +1081,6 @@
       <w:pPr>
         <w:pStyle w:val="Heading2"/>
         <w:bidi w:val="0"/>
-        <w:jc w:val="left"/>
         <w:rPr/>
       </w:pPr>
       <w:r>
@@ -1124,7 +1092,6 @@
       <w:pPr>
         <w:pStyle w:val="BodyText"/>
         <w:bidi w:val="0"/>
-        <w:jc w:val="left"/>
         <w:rPr/>
       </w:pPr>
       <w:r>
@@ -1146,7 +1113,6 @@
       <w:pPr>
         <w:pStyle w:val="Heading3"/>
         <w:bidi w:val="0"/>
-        <w:jc w:val="left"/>
         <w:rPr/>
       </w:pPr>
       <w:r>
@@ -1158,7 +1124,6 @@
       <w:pPr>
         <w:pStyle w:val="BodyText"/>
         <w:bidi w:val="0"/>
-        <w:jc w:val="left"/>
         <w:rPr/>
       </w:pPr>
       <w:r>
@@ -1170,7 +1135,6 @@
       <w:pPr>
         <w:pStyle w:val="BodyText"/>
         <w:bidi w:val="0"/>
-        <w:jc w:val="left"/>
         <w:rPr/>
       </w:pPr>
       <w:r>
@@ -1182,7 +1146,6 @@
       <w:pPr>
         <w:pStyle w:val="Heading3"/>
         <w:bidi w:val="0"/>
-        <w:jc w:val="left"/>
         <w:rPr/>
       </w:pPr>
       <w:r>
@@ -1194,7 +1157,6 @@
       <w:pPr>
         <w:pStyle w:val="BodyText"/>
         <w:bidi w:val="0"/>
-        <w:jc w:val="left"/>
         <w:rPr/>
       </w:pPr>
       <w:r>
@@ -1216,7 +1178,6 @@
         <w:bidi w:val="0"/>
         <w:spacing w:before="0" w:after="0"/>
         <w:ind w:hanging="283" w:left="709"/>
-        <w:jc w:val="left"/>
         <w:rPr/>
       </w:pPr>
       <w:r>
@@ -1258,7 +1219,6 @@
         <w:bidi w:val="0"/>
         <w:spacing w:before="0" w:after="0"/>
         <w:ind w:hanging="283" w:left="709"/>
-        <w:jc w:val="left"/>
         <w:rPr/>
       </w:pPr>
       <w:r>
@@ -1289,7 +1249,6 @@
         </w:tabs>
         <w:bidi w:val="0"/>
         <w:ind w:hanging="283" w:left="709"/>
-        <w:jc w:val="left"/>
         <w:rPr/>
       </w:pPr>
       <w:r>
@@ -1311,7 +1270,6 @@
       <w:pPr>
         <w:pStyle w:val="BodyText"/>
         <w:bidi w:val="0"/>
-        <w:jc w:val="left"/>
         <w:rPr/>
       </w:pPr>
       <w:r>
@@ -1323,7 +1281,6 @@
       <w:pPr>
         <w:pStyle w:val="Heading3"/>
         <w:bidi w:val="0"/>
-        <w:jc w:val="left"/>
         <w:rPr/>
       </w:pPr>
       <w:r>
@@ -1335,7 +1292,6 @@
       <w:pPr>
         <w:pStyle w:val="BodyText"/>
         <w:bidi w:val="0"/>
-        <w:jc w:val="left"/>
         <w:rPr/>
       </w:pPr>
       <w:r>
@@ -1347,7 +1303,6 @@
       <w:pPr>
         <w:pStyle w:val="BodyText"/>
         <w:bidi w:val="0"/>
-        <w:jc w:val="left"/>
         <w:rPr/>
       </w:pPr>
       <w:r>
@@ -1369,7 +1324,6 @@
       <w:pPr>
         <w:pStyle w:val="BodyText"/>
         <w:bidi w:val="0"/>
-        <w:jc w:val="left"/>
         <w:rPr/>
       </w:pPr>
       <w:r>
@@ -1381,7 +1335,6 @@
       <w:pPr>
         <w:pStyle w:val="Heading3"/>
         <w:bidi w:val="0"/>
-        <w:jc w:val="left"/>
         <w:rPr/>
       </w:pPr>
       <w:r>
@@ -1393,7 +1346,6 @@
       <w:pPr>
         <w:pStyle w:val="BodyText"/>
         <w:bidi w:val="0"/>
-        <w:jc w:val="left"/>
         <w:rPr/>
       </w:pPr>
       <w:r>
@@ -1405,7 +1357,6 @@
       <w:pPr>
         <w:pStyle w:val="Heading3"/>
         <w:bidi w:val="0"/>
-        <w:jc w:val="left"/>
         <w:rPr/>
       </w:pPr>
       <w:r>
@@ -1417,7 +1368,6 @@
       <w:pPr>
         <w:pStyle w:val="BodyText"/>
         <w:bidi w:val="0"/>
-        <w:jc w:val="left"/>
         <w:rPr/>
       </w:pPr>
       <w:r>
@@ -1429,7 +1379,6 @@
       <w:pPr>
         <w:pStyle w:val="Heading3"/>
         <w:bidi w:val="0"/>
-        <w:jc w:val="left"/>
         <w:rPr/>
       </w:pPr>
       <w:r>
@@ -1529,7 +1478,6 @@
               <w:widowControl w:val="false"/>
               <w:suppressLineNumbers/>
               <w:bidi w:val="0"/>
-              <w:jc w:val="left"/>
               <w:rPr/>
             </w:pPr>
             <w:r>
@@ -1554,7 +1502,6 @@
               <w:widowControl w:val="false"/>
               <w:suppressLineNumbers/>
               <w:bidi w:val="0"/>
-              <w:jc w:val="left"/>
               <w:rPr/>
             </w:pPr>
             <w:r>
@@ -1582,7 +1529,6 @@
               <w:widowControl w:val="false"/>
               <w:suppressLineNumbers/>
               <w:bidi w:val="0"/>
-              <w:jc w:val="left"/>
               <w:rPr/>
             </w:pPr>
             <w:r>
@@ -1607,7 +1553,6 @@
               <w:widowControl w:val="false"/>
               <w:suppressLineNumbers/>
               <w:bidi w:val="0"/>
-              <w:jc w:val="left"/>
               <w:rPr/>
             </w:pPr>
             <w:r>
@@ -1635,7 +1580,6 @@
               <w:widowControl w:val="false"/>
               <w:suppressLineNumbers/>
               <w:bidi w:val="0"/>
-              <w:jc w:val="left"/>
               <w:rPr/>
             </w:pPr>
             <w:r>
@@ -1660,7 +1604,6 @@
               <w:widowControl w:val="false"/>
               <w:suppressLineNumbers/>
               <w:bidi w:val="0"/>
-              <w:jc w:val="left"/>
               <w:rPr/>
             </w:pPr>
             <w:r>
@@ -1688,7 +1631,6 @@
               <w:widowControl w:val="false"/>
               <w:suppressLineNumbers/>
               <w:bidi w:val="0"/>
-              <w:jc w:val="left"/>
               <w:rPr/>
             </w:pPr>
             <w:r>
@@ -1713,7 +1655,6 @@
               <w:widowControl w:val="false"/>
               <w:suppressLineNumbers/>
               <w:bidi w:val="0"/>
-              <w:jc w:val="left"/>
               <w:rPr/>
             </w:pPr>
             <w:r>
@@ -1728,7 +1669,6 @@
       <w:pPr>
         <w:pStyle w:val="BodyText"/>
         <w:bidi w:val="0"/>
-        <w:jc w:val="left"/>
         <w:rPr/>
       </w:pPr>
       <w:r>
@@ -1750,7 +1690,6 @@
       <w:pPr>
         <w:pStyle w:val="HorizontalLine"/>
         <w:bidi w:val="0"/>
-        <w:jc w:val="left"/>
         <w:rPr/>
       </w:pPr>
       <w:r>
@@ -1761,7 +1700,6 @@
       <w:pPr>
         <w:pStyle w:val="Heading2"/>
         <w:bidi w:val="0"/>
-        <w:jc w:val="left"/>
         <w:rPr/>
       </w:pPr>
       <w:r>
@@ -1773,7 +1711,6 @@
       <w:pPr>
         <w:pStyle w:val="Heading3"/>
         <w:bidi w:val="0"/>
-        <w:jc w:val="left"/>
         <w:rPr/>
       </w:pPr>
       <w:r>
@@ -1785,7 +1722,6 @@
       <w:pPr>
         <w:pStyle w:val="BodyText"/>
         <w:bidi w:val="0"/>
-        <w:jc w:val="left"/>
         <w:rPr/>
       </w:pPr>
       <w:r>
@@ -1797,7 +1733,6 @@
       <w:pPr>
         <w:pStyle w:val="Heading3"/>
         <w:bidi w:val="0"/>
-        <w:jc w:val="left"/>
         <w:rPr/>
       </w:pPr>
       <w:r>
@@ -1809,7 +1744,6 @@
       <w:pPr>
         <w:pStyle w:val="BodyText"/>
         <w:bidi w:val="0"/>
-        <w:jc w:val="left"/>
         <w:rPr/>
       </w:pPr>
       <w:r>
@@ -1821,7 +1755,6 @@
       <w:pPr>
         <w:pStyle w:val="BodyText"/>
         <w:bidi w:val="0"/>
-        <w:jc w:val="left"/>
         <w:rPr/>
       </w:pPr>
       <w:r>
@@ -1839,7 +1772,6 @@
       <w:pPr>
         <w:pStyle w:val="Heading3"/>
         <w:bidi w:val="0"/>
-        <w:jc w:val="left"/>
         <w:rPr/>
       </w:pPr>
       <w:r>
@@ -1851,7 +1783,6 @@
       <w:pPr>
         <w:pStyle w:val="BodyText"/>
         <w:bidi w:val="0"/>
-        <w:jc w:val="left"/>
         <w:rPr/>
       </w:pPr>
       <w:r>
@@ -1863,7 +1794,6 @@
       <w:pPr>
         <w:pStyle w:val="Heading3"/>
         <w:bidi w:val="0"/>
-        <w:jc w:val="left"/>
         <w:rPr/>
       </w:pPr>
       <w:r>
@@ -1875,7 +1805,6 @@
       <w:pPr>
         <w:pStyle w:val="BodyText"/>
         <w:bidi w:val="0"/>
-        <w:jc w:val="left"/>
         <w:rPr/>
       </w:pPr>
       <w:r>
@@ -1887,7 +1816,6 @@
       <w:pPr>
         <w:pStyle w:val="HorizontalLine"/>
         <w:bidi w:val="0"/>
-        <w:jc w:val="left"/>
         <w:rPr/>
       </w:pPr>
       <w:r>
@@ -1898,7 +1826,6 @@
       <w:pPr>
         <w:pStyle w:val="Heading2"/>
         <w:bidi w:val="0"/>
-        <w:jc w:val="left"/>
         <w:rPr/>
       </w:pPr>
       <w:r>
@@ -1920,7 +1847,6 @@
         <w:bidi w:val="0"/>
         <w:spacing w:before="0" w:after="0"/>
         <w:ind w:hanging="283" w:left="709"/>
-        <w:jc w:val="left"/>
         <w:rPr/>
       </w:pPr>
       <w:r>
@@ -1948,7 +1874,6 @@
         <w:bidi w:val="0"/>
         <w:spacing w:before="0" w:after="0"/>
         <w:ind w:hanging="283" w:left="709"/>
-        <w:jc w:val="left"/>
         <w:rPr/>
       </w:pPr>
       <w:r>
@@ -1976,7 +1901,6 @@
         <w:bidi w:val="0"/>
         <w:spacing w:before="0" w:after="0"/>
         <w:ind w:hanging="283" w:left="709"/>
-        <w:jc w:val="left"/>
         <w:rPr/>
       </w:pPr>
       <w:r>
@@ -2004,7 +1928,6 @@
         <w:bidi w:val="0"/>
         <w:spacing w:before="0" w:after="0"/>
         <w:ind w:hanging="283" w:left="709"/>
-        <w:jc w:val="left"/>
         <w:rPr/>
       </w:pPr>
       <w:r>
@@ -2032,7 +1955,6 @@
         <w:bidi w:val="0"/>
         <w:spacing w:before="0" w:after="0"/>
         <w:ind w:hanging="283" w:left="709"/>
-        <w:jc w:val="left"/>
         <w:rPr/>
       </w:pPr>
       <w:r>
@@ -2060,7 +1982,6 @@
         <w:bidi w:val="0"/>
         <w:spacing w:before="0" w:after="0"/>
         <w:ind w:hanging="283" w:left="709"/>
-        <w:jc w:val="left"/>
         <w:rPr/>
       </w:pPr>
       <w:r>
@@ -2087,7 +2008,6 @@
         </w:tabs>
         <w:bidi w:val="0"/>
         <w:ind w:hanging="283" w:left="709"/>
-        <w:jc w:val="left"/>
         <w:rPr/>
       </w:pPr>
       <w:r>
@@ -2105,7 +2025,6 @@
       <w:pPr>
         <w:pStyle w:val="HorizontalLine"/>
         <w:bidi w:val="0"/>
-        <w:jc w:val="left"/>
         <w:rPr/>
       </w:pPr>
       <w:r>
@@ -2116,7 +2035,6 @@
       <w:pPr>
         <w:pStyle w:val="Heading2"/>
         <w:bidi w:val="0"/>
-        <w:jc w:val="left"/>
         <w:rPr/>
       </w:pPr>
       <w:r>
@@ -2216,7 +2134,6 @@
               <w:widowControl w:val="false"/>
               <w:suppressLineNumbers/>
               <w:bidi w:val="0"/>
-              <w:jc w:val="left"/>
               <w:rPr/>
             </w:pPr>
             <w:r>
@@ -2241,7 +2158,6 @@
               <w:widowControl w:val="false"/>
               <w:suppressLineNumbers/>
               <w:bidi w:val="0"/>
-              <w:jc w:val="left"/>
               <w:rPr/>
             </w:pPr>
             <w:r>
@@ -2269,7 +2185,6 @@
               <w:widowControl w:val="false"/>
               <w:suppressLineNumbers/>
               <w:bidi w:val="0"/>
-              <w:jc w:val="left"/>
               <w:rPr/>
             </w:pPr>
             <w:r>
@@ -2294,7 +2209,6 @@
               <w:widowControl w:val="false"/>
               <w:suppressLineNumbers/>
               <w:bidi w:val="0"/>
-              <w:jc w:val="left"/>
               <w:rPr/>
             </w:pPr>
             <w:r>
@@ -2322,7 +2236,6 @@
               <w:widowControl w:val="false"/>
               <w:suppressLineNumbers/>
               <w:bidi w:val="0"/>
-              <w:jc w:val="left"/>
               <w:rPr/>
             </w:pPr>
             <w:r>
@@ -2347,7 +2260,6 @@
               <w:widowControl w:val="false"/>
               <w:suppressLineNumbers/>
               <w:bidi w:val="0"/>
-              <w:jc w:val="left"/>
               <w:rPr/>
             </w:pPr>
             <w:r>
@@ -2375,7 +2287,6 @@
               <w:widowControl w:val="false"/>
               <w:suppressLineNumbers/>
               <w:bidi w:val="0"/>
-              <w:jc w:val="left"/>
               <w:rPr/>
             </w:pPr>
             <w:r>
@@ -2400,7 +2311,6 @@
               <w:widowControl w:val="false"/>
               <w:suppressLineNumbers/>
               <w:bidi w:val="0"/>
-              <w:jc w:val="left"/>
               <w:rPr/>
             </w:pPr>
             <w:r>
@@ -2428,7 +2338,6 @@
               <w:widowControl w:val="false"/>
               <w:suppressLineNumbers/>
               <w:bidi w:val="0"/>
-              <w:jc w:val="left"/>
               <w:rPr/>
             </w:pPr>
             <w:r>
@@ -2453,7 +2362,6 @@
               <w:widowControl w:val="false"/>
               <w:suppressLineNumbers/>
               <w:bidi w:val="0"/>
-              <w:jc w:val="left"/>
               <w:rPr/>
             </w:pPr>
             <w:r>
@@ -2468,7 +2376,6 @@
       <w:pPr>
         <w:pStyle w:val="BodyText"/>
         <w:bidi w:val="0"/>
-        <w:jc w:val="left"/>
         <w:rPr/>
       </w:pPr>
       <w:r>
@@ -2480,7 +2387,6 @@
       <w:pPr>
         <w:pStyle w:val="HorizontalLine"/>
         <w:bidi w:val="0"/>
-        <w:jc w:val="left"/>
         <w:rPr/>
       </w:pPr>
       <w:r>
@@ -2491,7 +2397,6 @@
       <w:pPr>
         <w:pStyle w:val="Heading2"/>
         <w:bidi w:val="0"/>
-        <w:jc w:val="left"/>
         <w:rPr/>
       </w:pPr>
       <w:r>
@@ -2513,7 +2418,6 @@
         <w:bidi w:val="0"/>
         <w:spacing w:before="0" w:after="0"/>
         <w:ind w:hanging="283" w:left="709"/>
-        <w:jc w:val="left"/>
         <w:rPr/>
       </w:pPr>
       <w:r>
@@ -2535,7 +2439,6 @@
         <w:bidi w:val="0"/>
         <w:spacing w:before="0" w:after="0"/>
         <w:ind w:hanging="283" w:left="709"/>
-        <w:jc w:val="left"/>
         <w:rPr/>
       </w:pPr>
       <w:r>
@@ -2557,7 +2460,6 @@
         <w:bidi w:val="0"/>
         <w:spacing w:before="0" w:after="140"/>
         <w:ind w:hanging="283" w:left="709"/>
-        <w:jc w:val="left"/>
         <w:rPr/>
       </w:pPr>
       <w:r>

</xml_diff>